<commit_message>
fixed due date BS calender not onening issue
</commit_message>
<xml_diff>
--- a/Sales_Feature_Checklist.docx
+++ b/Sales_Feature_Checklist.docx
@@ -12,9 +12,7 @@
     </w:p>
     <w:p>
       <w:r>
-        <w:t>Project: Afno360 ERP | Module: Sales</w:t>
-        <w:br/>
-        <w:t>Last updated: 2026-09-03</w:t>
+        <w:t>Last updated: 2026-09-11</w:t>
       </w:r>
     </w:p>
     <w:p>
@@ -198,7 +196,7 @@
         <w:pStyle w:val="ListBullet"/>
       </w:pPr>
       <w:r>
-        <w:t>[ ] Print / PDF export of invoice</w:t>
+        <w:t>[✓] Print / PDF export of invoice</w:t>
       </w:r>
     </w:p>
     <w:p>
@@ -374,7 +372,7 @@
         <w:pStyle w:val="ListBullet"/>
       </w:pPr>
       <w:r>
-        <w:t>[ ] Print invoice from detail page</w:t>
+        <w:t>[✓] Print invoice from detail page</w:t>
       </w:r>
     </w:p>
     <w:p>
@@ -1376,6 +1374,238 @@
     <w:p>
       <w:r>
         <w:t>* Delete / Void for Invoice and Return</w:t>
+      </w:r>
+    </w:p>
+    <w:p>
+      <w:pPr>
+        <w:pStyle w:val="Heading2"/>
+      </w:pPr>
+      <w:r>
+        <w:t>6. Printing Templates, Bill Printing &amp; Sales Return Summary (Completed Update)</w:t>
+      </w:r>
+    </w:p>
+    <w:p>
+      <w:pPr>
+        <w:pStyle w:val="Heading3"/>
+      </w:pPr>
+      <w:r>
+        <w:t>Completed Features</w:t>
+      </w:r>
+    </w:p>
+    <w:p>
+      <w:pPr>
+        <w:pStyle w:val="ListBullet"/>
+      </w:pPr>
+      <w:r>
+        <w:t>[✓] Print / PDF Export for Sales Invoices (1-click print dialog &amp; PDF output)</w:t>
+      </w:r>
+    </w:p>
+    <w:p>
+      <w:pPr>
+        <w:pStyle w:val="ListBullet"/>
+      </w:pPr>
+      <w:r>
+        <w:t>[✓] Built 4 Sales Invoice Printing Templates:</w:t>
+      </w:r>
+    </w:p>
+    <w:p>
+      <w:pPr>
+        <w:pStyle w:val="ListBullet"/>
+      </w:pPr>
+      <w:r>
+        <w:t xml:space="preserve">    • Traditional Tax Invoice (Laxminarayan style: boxed PAN/VAT, M/S header, Miti date, payable in words, notes &amp; signatures)</w:t>
+      </w:r>
+    </w:p>
+    <w:p>
+      <w:pPr>
+        <w:pStyle w:val="ListBullet"/>
+      </w:pPr>
+      <w:r>
+        <w:t xml:space="preserve">    • Retail Tax Invoice (Clean seller contact header, customer info block, item details, declaration &amp; signatures)</w:t>
+      </w:r>
+    </w:p>
+    <w:p>
+      <w:pPr>
+        <w:pStyle w:val="ListBullet"/>
+      </w:pPr>
+      <w:r>
+        <w:t xml:space="preserve">    • Invoice Standard (Modern blue theme header, detailed billed-to block, item table &amp; grand total summary box)</w:t>
+      </w:r>
+    </w:p>
+    <w:p>
+      <w:pPr>
+        <w:pStyle w:val="ListBullet"/>
+      </w:pPr>
+      <w:r>
+        <w:t xml:space="preserve">    • Invoice Minimal (Compact thermal / counter bill format)</w:t>
+      </w:r>
+    </w:p>
+    <w:p>
+      <w:pPr>
+        <w:pStyle w:val="ListBullet"/>
+      </w:pPr>
+      <w:r>
+        <w:t>[✓] Printing Templates Management Page (/configurations/printing-templates/):</w:t>
+      </w:r>
+    </w:p>
+    <w:p>
+      <w:pPr>
+        <w:pStyle w:val="ListBullet"/>
+      </w:pPr>
+      <w:r>
+        <w:t xml:space="preserve">    • Interactive visual template selector card grid</w:t>
+      </w:r>
+    </w:p>
+    <w:p>
+      <w:pPr>
+        <w:pStyle w:val="ListBullet"/>
+      </w:pPr>
+      <w:r>
+        <w:t xml:space="preserve">    • Full Company Information management form (Company Name, PAN/VAT, Address, Phone, Email, Branch, Footer Notes)</w:t>
+      </w:r>
+    </w:p>
+    <w:p>
+      <w:pPr>
+        <w:pStyle w:val="ListBullet"/>
+      </w:pPr>
+      <w:r>
+        <w:t>[✓] Dynamic Header &amp; Data Mapping:</w:t>
+      </w:r>
+    </w:p>
+    <w:p>
+      <w:pPr>
+        <w:pStyle w:val="ListBullet"/>
+      </w:pPr>
+      <w:r>
+        <w:t xml:space="preserve">    • Company header dynamically populates from your configured company info on all printed bills</w:t>
+      </w:r>
+    </w:p>
+    <w:p>
+      <w:pPr>
+        <w:pStyle w:val="ListBullet"/>
+      </w:pPr>
+      <w:r>
+        <w:t xml:space="preserve">    • Customer details, item list, quantities, rate, subtotal, VAT 13%, and totals populate dynamically</w:t>
+      </w:r>
+    </w:p>
+    <w:p>
+      <w:pPr>
+        <w:pStyle w:val="ListBullet"/>
+      </w:pPr>
+      <w:r>
+        <w:t>[✓] Live Print Preview Modal &amp; PDF Generation:</w:t>
+      </w:r>
+    </w:p>
+    <w:p>
+      <w:pPr>
+        <w:pStyle w:val="ListBullet"/>
+      </w:pPr>
+      <w:r>
+        <w:t xml:space="preserve">    • Live Print Preview modal with template switcher before printing</w:t>
+      </w:r>
+    </w:p>
+    <w:p>
+      <w:pPr>
+        <w:pStyle w:val="ListBullet"/>
+      </w:pPr>
+      <w:r>
+        <w:t xml:space="preserve">    • Resolved blank PDF printing bug by isolating top-level print container for clean window.print() output</w:t>
+      </w:r>
+    </w:p>
+    <w:p>
+      <w:pPr>
+        <w:pStyle w:val="ListBullet"/>
+      </w:pPr>
+      <w:r>
+        <w:t>[✓] Sales History UX Improvements:</w:t>
+      </w:r>
+    </w:p>
+    <w:p>
+      <w:pPr>
+        <w:pStyle w:val="ListBullet"/>
+      </w:pPr>
+      <w:r>
+        <w:t xml:space="preserve">    • Made entire table row in Sales History clickable to open invoice detail directly</w:t>
+      </w:r>
+    </w:p>
+    <w:p>
+      <w:pPr>
+        <w:pStyle w:val="ListBullet"/>
+      </w:pPr>
+      <w:r>
+        <w:t xml:space="preserve">    • Removed eye icon button in Action column while preserving print shortcut button with event propagation</w:t>
+      </w:r>
+    </w:p>
+    <w:p>
+      <w:pPr>
+        <w:pStyle w:val="ListBullet"/>
+      </w:pPr>
+      <w:r>
+        <w:t>[✓] Client-Requested Customization Refinements:</w:t>
+      </w:r>
+    </w:p>
+    <w:p>
+      <w:pPr>
+        <w:pStyle w:val="ListBullet"/>
+      </w:pPr>
+      <w:r>
+        <w:t xml:space="preserve">    • Removed Customer Copy &amp; Branch box from Retail Tax template header</w:t>
+      </w:r>
+    </w:p>
+    <w:p>
+      <w:pPr>
+        <w:pStyle w:val="ListBullet"/>
+      </w:pPr>
+      <w:r>
+        <w:t xml:space="preserve">    • Removed Code column from Traditional Tax template item list table</w:t>
+      </w:r>
+    </w:p>
+    <w:p>
+      <w:pPr>
+        <w:pStyle w:val="ListBullet"/>
+      </w:pPr>
+      <w:r>
+        <w:t xml:space="preserve">    • Removed Apps &amp; Config middle sidebar for clean full-width Printing Templates page view</w:t>
+      </w:r>
+    </w:p>
+    <w:p>
+      <w:pPr>
+        <w:pStyle w:val="ListBullet"/>
+      </w:pPr>
+      <w:r>
+        <w:t>[✓] Detailed Sales Return Summary Breakdown:</w:t>
+      </w:r>
+    </w:p>
+    <w:p>
+      <w:pPr>
+        <w:pStyle w:val="ListBullet"/>
+      </w:pPr>
+      <w:r>
+        <w:t xml:space="preserve">    • Expanded Return Summary in Sales Return (/sales/return/) to match New Sales layout</w:t>
+      </w:r>
+    </w:p>
+    <w:p>
+      <w:pPr>
+        <w:pStyle w:val="ListBullet"/>
+      </w:pPr>
+      <w:r>
+        <w:t xml:space="preserve">    • Displays Sub Total, Discount, Non Taxable Amount, Taxable Amount, VAT (13%), Round Off input, and Total Return Amount</w:t>
+      </w:r>
+    </w:p>
+    <w:p>
+      <w:pPr>
+        <w:pStyle w:val="ListBullet"/>
+      </w:pPr>
+      <w:r>
+        <w:t>[✓] Fixed Due Date BS Picker in New Sales:</w:t>
+      </w:r>
+    </w:p>
+    <w:p>
+      <w:pPr>
+        <w:pStyle w:val="ListBullet"/>
+      </w:pPr>
+      <w:r>
+        <w:t xml:space="preserve">    • Resolved click event propagation and pointer event overlay on Due Date BS field (due_date_bs)</w:t>
       </w:r>
     </w:p>
     <w:sectPr>

</xml_diff>